<commit_message>
Global points for digitising
</commit_message>
<xml_diff>
--- a/Writing/Final/Literature Review/RoughWork.docx
+++ b/Writing/Final/Literature Review/RoughWork.docx
@@ -1,6 +1,6 @@
 
 <file path=word/document.xml><?xml version="1.0" encoding="utf-8"?>
-<w:document xmlns:wpc="http://schemas.microsoft.com/office/word/2010/wordprocessingCanvas" xmlns:cx="http://schemas.microsoft.com/office/drawing/2014/chartex" xmlns:cx1="http://schemas.microsoft.com/office/drawing/2015/9/8/chartex" xmlns:cx2="http://schemas.microsoft.com/office/drawing/2015/10/21/chartex" xmlns:cx3="http://schemas.microsoft.com/office/drawing/2016/5/9/chartex" xmlns:cx4="http://schemas.microsoft.com/office/drawing/2016/5/10/chartex" xmlns:cx5="http://schemas.microsoft.com/office/drawing/2016/5/11/chartex" xmlns:cx6="http://schemas.microsoft.com/office/drawing/2016/5/12/chartex" xmlns:cx7="http://schemas.microsoft.com/office/drawing/2016/5/13/chartex" xmlns:cx8="http://schemas.microsoft.com/office/drawing/2016/5/14/chartex" xmlns:mc="http://schemas.openxmlformats.org/markup-compatibility/2006" xmlns:aink="http://schemas.microsoft.com/office/drawing/2016/ink" xmlns:am3d="http://schemas.microsoft.com/office/drawing/2017/model3d" xmlns:o="urn:schemas-microsoft-com:office:office" xmlns:oel="http://schemas.microsoft.com/office/2019/extlst" xmlns:r="http://schemas.openxmlformats.org/officeDocument/2006/relationships" xmlns:m="http://schemas.openxmlformats.org/officeDocument/2006/math" xmlns:v="urn:schemas-microsoft-com:vml" xmlns:wp14="http://schemas.microsoft.com/office/word/2010/wordprocessingDrawing" xmlns:wp="http://schemas.openxmlformats.org/drawingml/2006/wordprocessingDrawing" xmlns:w10="urn:schemas-microsoft-com:office:word" xmlns:w="http://schemas.openxmlformats.org/wordprocessingml/2006/main" xmlns:w14="http://schemas.microsoft.com/office/word/2010/wordml" xmlns:w15="http://schemas.microsoft.com/office/word/2012/wordml" xmlns:w16cex="http://schemas.microsoft.com/office/word/2018/wordml/cex" xmlns:w16cid="http://schemas.microsoft.com/office/word/2016/wordml/cid" xmlns:w16="http://schemas.microsoft.com/office/word/2018/wordml" xmlns:w16du="http://schemas.microsoft.com/office/word/2023/wordml/word16du" xmlns:w16sdtdh="http://schemas.microsoft.com/office/word/2020/wordml/sdtdatahash" xmlns:w16sdtfl="http://schemas.microsoft.com/office/word/2024/wordml/sdtformatlock" xmlns:w16se="http://schemas.microsoft.com/office/word/2015/wordml/symex" xmlns:wpg="http://schemas.microsoft.com/office/word/2010/wordprocessingGroup" xmlns:wpi="http://schemas.microsoft.com/office/word/2010/wordprocessingInk" xmlns:wne="http://schemas.microsoft.com/office/word/2006/wordml" xmlns:wps="http://schemas.microsoft.com/office/word/2010/wordprocessingShape" mc:Ignorable="w14 w15 w16se w16cid w16 w16cex w16sdtdh w16sdtfl w16du wp14">
+<w:document xmlns:wpc="http://schemas.microsoft.com/office/word/2010/wordprocessingCanvas" xmlns:cx="http://schemas.microsoft.com/office/drawing/2014/chartex" xmlns:cx1="http://schemas.microsoft.com/office/drawing/2015/9/8/chartex" xmlns:cx2="http://schemas.microsoft.com/office/drawing/2015/10/21/chartex" xmlns:cx3="http://schemas.microsoft.com/office/drawing/2016/5/9/chartex" xmlns:cx4="http://schemas.microsoft.com/office/drawing/2016/5/10/chartex" xmlns:cx5="http://schemas.microsoft.com/office/drawing/2016/5/11/chartex" xmlns:cx6="http://schemas.microsoft.com/office/drawing/2016/5/12/chartex" xmlns:cx7="http://schemas.microsoft.com/office/drawing/2016/5/13/chartex" xmlns:cx8="http://schemas.microsoft.com/office/drawing/2016/5/14/chartex" xmlns:mc="http://schemas.openxmlformats.org/markup-compatibility/2006" xmlns:aink="http://schemas.microsoft.com/office/drawing/2016/ink" xmlns:am3d="http://schemas.microsoft.com/office/drawing/2017/model3d" xmlns:o="urn:schemas-microsoft-com:office:office" xmlns:oel="http://schemas.microsoft.com/office/2019/extlst" xmlns:r="http://schemas.openxmlformats.org/officeDocument/2006/relationships" xmlns:m="http://schemas.openxmlformats.org/officeDocument/2006/math" xmlns:v="urn:schemas-microsoft-com:vml" xmlns:wp14="http://schemas.microsoft.com/office/word/2010/wordprocessingDrawing" xmlns:wp="http://schemas.openxmlformats.org/drawingml/2006/wordprocessingDrawing" xmlns:w10="urn:schemas-microsoft-com:office:word" xmlns:w="http://schemas.openxmlformats.org/wordprocessingml/2006/main" xmlns:w14="http://schemas.microsoft.com/office/word/2010/wordml" xmlns:w15="http://schemas.microsoft.com/office/word/2012/wordml" xmlns:w16cei="http://schemas.microsoft.com/office/word/2026/wordml/cei" xmlns:w16cex="http://schemas.microsoft.com/office/word/2018/wordml/cex" xmlns:w16cid="http://schemas.microsoft.com/office/word/2016/wordml/cid" xmlns:w16="http://schemas.microsoft.com/office/word/2018/wordml" xmlns:w16du="http://schemas.microsoft.com/office/word/2023/wordml/word16du" xmlns:w16sdtdh="http://schemas.microsoft.com/office/word/2020/wordml/sdtdatahash" xmlns:w16sdtfl="http://schemas.microsoft.com/office/word/2024/wordml/sdtformatlock" xmlns:w16se="http://schemas.microsoft.com/office/word/2015/wordml/symex" xmlns:wpg="http://schemas.microsoft.com/office/word/2010/wordprocessingGroup" xmlns:wpi="http://schemas.microsoft.com/office/word/2010/wordprocessingInk" xmlns:wne="http://schemas.microsoft.com/office/word/2006/wordml" xmlns:wps="http://schemas.microsoft.com/office/word/2010/wordprocessingShape" mc:Ignorable="w14 w15 w16se w16cid w16 w16cex w16sdtdh w16sdtfl w16du wp14">
   <w:body>
     <w:p>
       <w:pPr>
@@ -10,7 +10,11 @@
         <w:t>Notes for changes and investigation</w:t>
       </w:r>
     </w:p>
-    <w:p/>
+    <w:p>
+      <w:r>
+        <w:t>Study Area</w:t>
+      </w:r>
+    </w:p>
     <w:p>
       <w:pPr>
         <w:pStyle w:val="ListParagraph"/>
@@ -24,6 +28,11 @@
       </w:r>
     </w:p>
     <w:p>
+      <w:r>
+        <w:t>Data</w:t>
+      </w:r>
+    </w:p>
+    <w:p>
       <w:pPr>
         <w:pStyle w:val="ListParagraph"/>
         <w:numPr>
@@ -32,111 +41,7 @@
         </w:numPr>
       </w:pPr>
       <w:r>
-        <w:t xml:space="preserve">Include Crenian DEEP-PLAST study as context, as related work, what they say for future work and then defence for the thesis. </w:t>
-      </w:r>
-    </w:p>
-    <w:p>
-      <w:pPr>
-        <w:pStyle w:val="ListParagraph"/>
-        <w:numPr>
-          <w:ilvl w:val="0"/>
-          <w:numId w:val="16"/>
-        </w:numPr>
-      </w:pPr>
-      <w:r>
-        <w:t>Look into OPAT for drift model</w:t>
-      </w:r>
-    </w:p>
-    <w:p>
-      <w:pPr>
-        <w:pStyle w:val="ListParagraph"/>
-        <w:numPr>
-          <w:ilvl w:val="0"/>
-          <w:numId w:val="16"/>
-        </w:numPr>
-      </w:pPr>
-      <w:r>
-        <w:t xml:space="preserve">Integrate Planet into the detection framework. </w:t>
-      </w:r>
-    </w:p>
-    <w:p>
-      <w:pPr>
-        <w:pStyle w:val="ListParagraph"/>
-        <w:numPr>
-          <w:ilvl w:val="0"/>
-          <w:numId w:val="16"/>
-        </w:numPr>
-      </w:pPr>
-      <w:r>
-        <w:t>Look into new variables for the drift model – specifically SMOC</w:t>
-      </w:r>
-      <w:r>
-        <w:t xml:space="preserve"> (Surface merged Ocean Current).</w:t>
-      </w:r>
-      <w:r>
-        <w:t xml:space="preserve"> </w:t>
-      </w:r>
-      <w:r>
-        <w:t>Global Ocean Physics Analysis and Forecast</w:t>
-      </w:r>
-    </w:p>
-    <w:p>
-      <w:pPr>
-        <w:pStyle w:val="ListParagraph"/>
-        <w:numPr>
-          <w:ilvl w:val="0"/>
-          <w:numId w:val="16"/>
-        </w:numPr>
-      </w:pPr>
-      <w:r>
-        <w:t xml:space="preserve">OPAT as just a reference for the architecture of the project. </w:t>
-      </w:r>
-      <w:r>
-        <w:t>So,</w:t>
-      </w:r>
-      <w:r>
-        <w:t xml:space="preserve"> including the drift and the cross sensor play. </w:t>
-      </w:r>
-    </w:p>
-    <w:p>
-      <w:pPr>
-        <w:pStyle w:val="ListParagraph"/>
-        <w:numPr>
-          <w:ilvl w:val="0"/>
-          <w:numId w:val="16"/>
-        </w:numPr>
-      </w:pPr>
-      <w:proofErr w:type="spellStart"/>
-      <w:r>
-        <w:t>MobiDrift</w:t>
-      </w:r>
-      <w:proofErr w:type="spellEnd"/>
-      <w:r>
-        <w:t xml:space="preserve"> as well…. </w:t>
-      </w:r>
-    </w:p>
-    <w:p>
-      <w:pPr>
-        <w:pStyle w:val="ListParagraph"/>
-        <w:numPr>
-          <w:ilvl w:val="0"/>
-          <w:numId w:val="16"/>
-        </w:numPr>
-      </w:pPr>
-      <w:r>
-        <w:t>MOBIDRIFT 100-day drifter dataset”</w:t>
-      </w:r>
-    </w:p>
-    <w:p>
-      <w:pPr>
-        <w:pStyle w:val="ListParagraph"/>
-        <w:numPr>
-          <w:ilvl w:val="0"/>
-          <w:numId w:val="16"/>
-        </w:numPr>
-      </w:pPr>
-      <w:r>
-        <w:t>NOAA Drifter data</w:t>
+        <w:t>Look at the MADOS dataset for transforming to SAR for Marine litter as well as for the exclusion of false positives</w:t>
       </w:r>
     </w:p>
     <w:p>
@@ -162,13 +67,11 @@
     <w:p>
       <w:pPr>
         <w:pStyle w:val="ListParagraph"/>
-        <w:numPr>
-          <w:ilvl w:val="0"/>
-          <w:numId w:val="16"/>
-        </w:numPr>
-      </w:pPr>
-      <w:r>
-        <w:t>Planet data has a revisit of 1 day = very useful for between observations</w:t>
+      </w:pPr>
+    </w:p>
+    <w:p>
+      <w:r>
+        <w:t>Drift</w:t>
       </w:r>
     </w:p>
     <w:p>
@@ -180,13 +83,251 @@
         </w:numPr>
       </w:pPr>
       <w:r>
-        <w:t xml:space="preserve">Circular manner, look for this </w:t>
-      </w:r>
-    </w:p>
-    <w:p>
-      <w:pPr>
-        <w:ind w:left="360"/>
-      </w:pPr>
+        <w:t>Include Crenian DEEP-PLAST study as context, as related work, what they say for future work and then defence for the thesis.</w:t>
+      </w:r>
+    </w:p>
+    <w:p>
+      <w:pPr>
+        <w:pStyle w:val="ListParagraph"/>
+        <w:numPr>
+          <w:ilvl w:val="0"/>
+          <w:numId w:val="16"/>
+        </w:numPr>
+      </w:pPr>
+      <w:r>
+        <w:t>Look into OPAT for drift model</w:t>
+      </w:r>
+    </w:p>
+    <w:p>
+      <w:pPr>
+        <w:pStyle w:val="ListParagraph"/>
+        <w:numPr>
+          <w:ilvl w:val="0"/>
+          <w:numId w:val="16"/>
+        </w:numPr>
+      </w:pPr>
+      <w:r>
+        <w:t>Look into new variables for the drift model – specifically SMOC</w:t>
+      </w:r>
+      <w:r>
+        <w:t xml:space="preserve"> (Surface merged Ocean Current).</w:t>
+      </w:r>
+      <w:r>
+        <w:t xml:space="preserve"> </w:t>
+      </w:r>
+      <w:r>
+        <w:t>Global Ocean Physics Analysis and Forecast</w:t>
+      </w:r>
+    </w:p>
+    <w:p>
+      <w:pPr>
+        <w:pStyle w:val="ListParagraph"/>
+      </w:pPr>
+    </w:p>
+    <w:p>
+      <w:r>
+        <w:t>Transfer learning (SSL)</w:t>
+      </w:r>
+    </w:p>
+    <w:p>
+      <w:r>
+        <w:t xml:space="preserve"> -</w:t>
+      </w:r>
+      <w:r>
+        <w:t>(</w:t>
+      </w:r>
+      <w:proofErr w:type="spellStart"/>
+      <w:r>
+        <w:t>Yekeen</w:t>
+      </w:r>
+      <w:proofErr w:type="spellEnd"/>
+      <w:r>
+        <w:t xml:space="preserve"> et al., 2020, Zeng and Wang, 2020, Ebrahimi and Sahebi, 2024</w:t>
+      </w:r>
+    </w:p>
+    <w:p>
+      <w:r>
+        <w:t xml:space="preserve"> </w:t>
+      </w:r>
+      <w:proofErr w:type="spellStart"/>
+      <w:r>
+        <w:t>Yekeen</w:t>
+      </w:r>
+      <w:proofErr w:type="spellEnd"/>
+      <w:r>
+        <w:t>, S. T., Balogun, A.-L., Yusof, K. B. W., 2020. A novel deep learning instance segmentation model for automated marine oil spill detection. ISPRS Journal of Photogrammetry and Remote Sensing, 167, 190–200.</w:t>
+      </w:r>
+    </w:p>
+    <w:p>
+      <w:r>
+        <w:t>Zeng, K., Wang, Y., 2020. A deep convolutional neural network for oil spill detection from spaceborne SAR images. Remote Sensing, 12(6), 1015.</w:t>
+      </w:r>
+    </w:p>
+    <w:p>
+      <w:r>
+        <w:t xml:space="preserve">Ebrahimi, M., Sahebi, M. R., 2024. A transfer </w:t>
+      </w:r>
+      <w:proofErr w:type="spellStart"/>
+      <w:r>
+        <w:t>learningDCNN</w:t>
+      </w:r>
+      <w:proofErr w:type="spellEnd"/>
+      <w:r>
+        <w:t xml:space="preserve"> based oil spill detection using compact polarimetric SAR data. Remote Sensing Applications: Society and Environment, 101417.</w:t>
+      </w:r>
+    </w:p>
+    <w:p>
+      <w:pPr>
+        <w:pStyle w:val="ListParagraph"/>
+      </w:pPr>
+    </w:p>
+    <w:p>
+      <w:r>
+        <w:t>Architecture</w:t>
+      </w:r>
+    </w:p>
+    <w:p>
+      <w:pPr>
+        <w:pStyle w:val="ListParagraph"/>
+        <w:numPr>
+          <w:ilvl w:val="0"/>
+          <w:numId w:val="16"/>
+        </w:numPr>
+      </w:pPr>
+      <w:r>
+        <w:t xml:space="preserve">Deep Learned features? </w:t>
+      </w:r>
+    </w:p>
+    <w:p>
+      <w:pPr>
+        <w:pStyle w:val="ListParagraph"/>
+        <w:numPr>
+          <w:ilvl w:val="0"/>
+          <w:numId w:val="16"/>
+        </w:numPr>
+      </w:pPr>
+      <w:r>
+        <w:t>MARINEXT</w:t>
+      </w:r>
+      <w:r>
+        <w:t xml:space="preserve"> is a model for consideration</w:t>
+      </w:r>
+      <w:r>
+        <w:t>, improved deep learning for marine context</w:t>
+      </w:r>
+    </w:p>
+    <w:p>
+      <w:pPr>
+        <w:pStyle w:val="ListParagraph"/>
+      </w:pPr>
+    </w:p>
+    <w:p>
+      <w:pPr>
+        <w:pStyle w:val="ListParagraph"/>
+        <w:numPr>
+          <w:ilvl w:val="0"/>
+          <w:numId w:val="16"/>
+        </w:numPr>
+      </w:pPr>
+      <w:proofErr w:type="spellStart"/>
+      <w:r>
+        <w:t>Superpixel</w:t>
+      </w:r>
+      <w:proofErr w:type="spellEnd"/>
+      <w:r>
+        <w:t xml:space="preserve"> segmentation? </w:t>
+      </w:r>
+    </w:p>
+    <w:p>
+      <w:pPr>
+        <w:pStyle w:val="ListParagraph"/>
+      </w:pPr>
+    </w:p>
+    <w:p>
+      <w:pPr>
+        <w:pStyle w:val="ListParagraph"/>
+      </w:pPr>
+    </w:p>
+    <w:p>
+      <w:pPr>
+        <w:pStyle w:val="ListParagraph"/>
+        <w:numPr>
+          <w:ilvl w:val="0"/>
+          <w:numId w:val="16"/>
+        </w:numPr>
+      </w:pPr>
+      <w:r>
+        <w:t xml:space="preserve">OPAT as just a reference for the architecture of the project. </w:t>
+      </w:r>
+      <w:r>
+        <w:t>So,</w:t>
+      </w:r>
+      <w:r>
+        <w:t xml:space="preserve"> including the drift and the cross sensor play. </w:t>
+      </w:r>
+    </w:p>
+    <w:p>
+      <w:pPr>
+        <w:pStyle w:val="ListParagraph"/>
+      </w:pPr>
+    </w:p>
+    <w:p>
+      <w:pPr>
+        <w:pStyle w:val="ListParagraph"/>
+      </w:pPr>
+    </w:p>
+    <w:p/>
+    <w:p/>
+    <w:p>
+      <w:pPr>
+        <w:pStyle w:val="Heading2"/>
+      </w:pPr>
+      <w:r>
+        <w:t>Notes on papers</w:t>
+      </w:r>
+    </w:p>
+    <w:p/>
+    <w:p>
+      <w:pPr>
+        <w:pStyle w:val="Heading4"/>
+      </w:pPr>
+      <w:r>
+        <w:t xml:space="preserve">1) </w:t>
+      </w:r>
+      <w:r>
+        <w:t>Detecting Marine Pollutants Using Sentinel-1 SAR and Sentinel-2 Optical Imagery Jason Manesis</w:t>
+      </w:r>
+    </w:p>
+    <w:p>
+      <w:r>
+        <w:t xml:space="preserve">- Created a dataset using MADOS (S2) to SAR but observed that Marine debris could not be created correctly. </w:t>
+      </w:r>
+    </w:p>
+    <w:p>
+      <w:r>
+        <w:t xml:space="preserve">- </w:t>
+      </w:r>
+      <w:r>
+        <w:t>MARINEXT</w:t>
+      </w:r>
+      <w:r>
+        <w:t xml:space="preserve"> is a model for consideration</w:t>
+      </w:r>
+    </w:p>
+    <w:p>
+      <w:r>
+        <w:t>Sentinel-1 SAR image dataset containing samples of oil spills, low-wind areas, sea surface, ships, and offshore platforms.</w:t>
+      </w:r>
+    </w:p>
+    <w:p>
+      <w:r>
+        <w:t>Using MADOS, we also investigate the feasibility of mapping previously reported marine debris in SAR imagery.</w:t>
+      </w:r>
+    </w:p>
+    <w:p>
+      <w:r>
+        <w:t>The dataset could be further expanded to include additional floating matters (e.g., macroalgae such as Sargassum, Sea snot, and Marine Debris) and environmental variables (wind, currents, and other oceanographic factors) to improve model accuracy and generalization for SAR-based marine pollution monitoring.</w:t>
+      </w:r>
     </w:p>
     <w:p/>
     <w:p/>
@@ -197,6 +338,20 @@
     <w:p/>
     <w:p/>
     <w:p/>
+    <w:p/>
+    <w:p/>
+    <w:p/>
+    <w:p/>
+    <w:p/>
+    <w:p/>
+    <w:p/>
+    <w:p/>
+    <w:p/>
+    <w:p/>
+    <w:p/>
+    <w:p/>
+    <w:p/>
+    <w:p/>
     <w:p>
       <w:r>
         <w:t xml:space="preserve">Below is a technically detailed description of what </w:t>
@@ -357,7 +512,6 @@
           <w:b/>
           <w:bCs/>
         </w:rPr>
-        <w:lastRenderedPageBreak/>
         <w:t>Sentinel-2 semantic segmentation</w:t>
       </w:r>
       <w:r>
@@ -821,6 +975,7 @@
         </w:numPr>
       </w:pPr>
       <w:r>
+        <w:lastRenderedPageBreak/>
         <w:t>UAV: ~</w:t>
       </w:r>
       <w:r>
@@ -1215,7 +1370,6 @@
           <w:b/>
           <w:bCs/>
         </w:rPr>
-        <w:lastRenderedPageBreak/>
         <w:t>UAV preprocessing / alignment:</w:t>
       </w:r>
     </w:p>
@@ -1704,6 +1858,7 @@
     </w:p>
     <w:p>
       <w:r>
+        <w:lastRenderedPageBreak/>
         <w:t xml:space="preserve">They trained </w:t>
       </w:r>
       <w:r>
@@ -2109,7 +2264,6 @@
         </w:numPr>
       </w:pPr>
       <w:r>
-        <w:lastRenderedPageBreak/>
         <w:t xml:space="preserve">Object detection correctness: </w:t>
       </w:r>
       <w:proofErr w:type="spellStart"/>
@@ -2545,6 +2699,9 @@
       </w:r>
       <w:r>
         <w:br/>
+      </w:r>
+      <w:r>
+        <w:lastRenderedPageBreak/>
         <w:t>They also describe this as “2% wind drag” elsewhere in the drift description (so windage is small and parameterised). (</w:t>
       </w:r>
       <w:hyperlink r:id="rId49" w:tooltip="Empowering Sustainability Through AI-Driven Monitoring: The DEEP-PLAST Approach to Marine Plastic Detection and Trajectory Prediction for the Black Sea" w:history="1">
@@ -2799,7 +2956,6 @@
           <w:b/>
           <w:bCs/>
         </w:rPr>
-        <w:lastRenderedPageBreak/>
         <w:t>B) “Negatives matter” and label imbalance is unavoidable</w:t>
       </w:r>
     </w:p>
@@ -3064,6 +3220,7 @@
           <w:b/>
           <w:bCs/>
         </w:rPr>
+        <w:lastRenderedPageBreak/>
         <w:t>Scene-based splitting</w:t>
       </w:r>
       <w:r>
@@ -3313,11 +3470,7 @@
         <w:t>UAV-derived ground truth</w:t>
       </w:r>
       <w:r>
-        <w:t xml:space="preserve"> and co-registration within ±6 hours; if you cannot collect UAV data (or drifter tracks), you will need alternative “strong </w:t>
-      </w:r>
-      <w:r>
-        <w:lastRenderedPageBreak/>
-        <w:t>label” sources (targeted deployments, opportunistic sightings, controlled experiments). (</w:t>
+        <w:t xml:space="preserve"> and co-registration within ±6 hours; if you cannot collect UAV data (or drifter tracks), you will need alternative “strong label” sources (targeted deployments, opportunistic sightings, controlled experiments). (</w:t>
       </w:r>
       <w:hyperlink r:id="rId66" w:tooltip="Empowering Sustainability Through AI-Driven Monitoring: The DEEP-PLAST Approach to Marine Plastic Detection and Trajectory Prediction for the Black Sea" w:history="1">
         <w:r>
@@ -3553,6 +3706,7 @@
     <w:p>
       <w:proofErr w:type="spellStart"/>
       <w:r>
+        <w:lastRenderedPageBreak/>
         <w:t>Cernian</w:t>
       </w:r>
       <w:proofErr w:type="spellEnd"/>
@@ -3611,7 +3765,7 @@
 </file>
 
 <file path=word/numbering.xml><?xml version="1.0" encoding="utf-8"?>
-<w:numbering xmlns:wpc="http://schemas.microsoft.com/office/word/2010/wordprocessingCanvas" xmlns:cx="http://schemas.microsoft.com/office/drawing/2014/chartex" xmlns:cx1="http://schemas.microsoft.com/office/drawing/2015/9/8/chartex" xmlns:cx2="http://schemas.microsoft.com/office/drawing/2015/10/21/chartex" xmlns:cx3="http://schemas.microsoft.com/office/drawing/2016/5/9/chartex" xmlns:cx4="http://schemas.microsoft.com/office/drawing/2016/5/10/chartex" xmlns:cx5="http://schemas.microsoft.com/office/drawing/2016/5/11/chartex" xmlns:cx6="http://schemas.microsoft.com/office/drawing/2016/5/12/chartex" xmlns:cx7="http://schemas.microsoft.com/office/drawing/2016/5/13/chartex" xmlns:cx8="http://schemas.microsoft.com/office/drawing/2016/5/14/chartex" xmlns:mc="http://schemas.openxmlformats.org/markup-compatibility/2006" xmlns:aink="http://schemas.microsoft.com/office/drawing/2016/ink" xmlns:am3d="http://schemas.microsoft.com/office/drawing/2017/model3d" xmlns:o="urn:schemas-microsoft-com:office:office" xmlns:oel="http://schemas.microsoft.com/office/2019/extlst" xmlns:r="http://schemas.openxmlformats.org/officeDocument/2006/relationships" xmlns:m="http://schemas.openxmlformats.org/officeDocument/2006/math" xmlns:v="urn:schemas-microsoft-com:vml" xmlns:wp14="http://schemas.microsoft.com/office/word/2010/wordprocessingDrawing" xmlns:wp="http://schemas.openxmlformats.org/drawingml/2006/wordprocessingDrawing" xmlns:w10="urn:schemas-microsoft-com:office:word" xmlns:w="http://schemas.openxmlformats.org/wordprocessingml/2006/main" xmlns:w14="http://schemas.microsoft.com/office/word/2010/wordml" xmlns:w15="http://schemas.microsoft.com/office/word/2012/wordml" xmlns:w16cex="http://schemas.microsoft.com/office/word/2018/wordml/cex" xmlns:w16cid="http://schemas.microsoft.com/office/word/2016/wordml/cid" xmlns:w16="http://schemas.microsoft.com/office/word/2018/wordml" xmlns:w16du="http://schemas.microsoft.com/office/word/2023/wordml/word16du" xmlns:w16sdtdh="http://schemas.microsoft.com/office/word/2020/wordml/sdtdatahash" xmlns:w16sdtfl="http://schemas.microsoft.com/office/word/2024/wordml/sdtformatlock" xmlns:w16se="http://schemas.microsoft.com/office/word/2015/wordml/symex" xmlns:wpg="http://schemas.microsoft.com/office/word/2010/wordprocessingGroup" xmlns:wpi="http://schemas.microsoft.com/office/word/2010/wordprocessingInk" xmlns:wne="http://schemas.microsoft.com/office/word/2006/wordml" xmlns:wps="http://schemas.microsoft.com/office/word/2010/wordprocessingShape" mc:Ignorable="w14 w15 w16se w16cid w16 w16cex w16sdtdh w16sdtfl w16du wp14">
+<w:numbering xmlns:wpc="http://schemas.microsoft.com/office/word/2010/wordprocessingCanvas" xmlns:cx="http://schemas.microsoft.com/office/drawing/2014/chartex" xmlns:cx1="http://schemas.microsoft.com/office/drawing/2015/9/8/chartex" xmlns:cx2="http://schemas.microsoft.com/office/drawing/2015/10/21/chartex" xmlns:cx3="http://schemas.microsoft.com/office/drawing/2016/5/9/chartex" xmlns:cx4="http://schemas.microsoft.com/office/drawing/2016/5/10/chartex" xmlns:cx5="http://schemas.microsoft.com/office/drawing/2016/5/11/chartex" xmlns:cx6="http://schemas.microsoft.com/office/drawing/2016/5/12/chartex" xmlns:cx7="http://schemas.microsoft.com/office/drawing/2016/5/13/chartex" xmlns:cx8="http://schemas.microsoft.com/office/drawing/2016/5/14/chartex" xmlns:mc="http://schemas.openxmlformats.org/markup-compatibility/2006" xmlns:aink="http://schemas.microsoft.com/office/drawing/2016/ink" xmlns:am3d="http://schemas.microsoft.com/office/drawing/2017/model3d" xmlns:o="urn:schemas-microsoft-com:office:office" xmlns:oel="http://schemas.microsoft.com/office/2019/extlst" xmlns:r="http://schemas.openxmlformats.org/officeDocument/2006/relationships" xmlns:m="http://schemas.openxmlformats.org/officeDocument/2006/math" xmlns:v="urn:schemas-microsoft-com:vml" xmlns:wp14="http://schemas.microsoft.com/office/word/2010/wordprocessingDrawing" xmlns:wp="http://schemas.openxmlformats.org/drawingml/2006/wordprocessingDrawing" xmlns:w10="urn:schemas-microsoft-com:office:word" xmlns:w="http://schemas.openxmlformats.org/wordprocessingml/2006/main" xmlns:w14="http://schemas.microsoft.com/office/word/2010/wordml" xmlns:w15="http://schemas.microsoft.com/office/word/2012/wordml" xmlns:w16cei="http://schemas.microsoft.com/office/word/2026/wordml/cei" xmlns:w16cex="http://schemas.microsoft.com/office/word/2018/wordml/cex" xmlns:w16cid="http://schemas.microsoft.com/office/word/2016/wordml/cid" xmlns:w16="http://schemas.microsoft.com/office/word/2018/wordml" xmlns:w16du="http://schemas.microsoft.com/office/word/2023/wordml/word16du" xmlns:w16sdtdh="http://schemas.microsoft.com/office/word/2020/wordml/sdtdatahash" xmlns:w16sdtfl="http://schemas.microsoft.com/office/word/2024/wordml/sdtformatlock" xmlns:w16se="http://schemas.microsoft.com/office/word/2015/wordml/symex" xmlns:wpg="http://schemas.microsoft.com/office/word/2010/wordprocessingGroup" xmlns:wpi="http://schemas.microsoft.com/office/word/2010/wordprocessingInk" xmlns:wne="http://schemas.microsoft.com/office/word/2006/wordml" xmlns:wps="http://schemas.microsoft.com/office/word/2010/wordprocessingShape" mc:Ignorable="w14 w15 w16se w16cid w16 w16cex w16sdtdh w16sdtfl w16du wp14">
   <w:abstractNum w:abstractNumId="0" w15:restartNumberingAfterBreak="0">
     <w:nsid w:val="035A4B4C"/>
     <w:multiLevelType w:val="multilevel"/>
@@ -6293,7 +6447,6 @@
     <w:next w:val="Normal"/>
     <w:link w:val="Heading2Char"/>
     <w:uiPriority w:val="9"/>
-    <w:semiHidden/>
     <w:unhideWhenUsed/>
     <w:qFormat/>
     <w:rsid w:val="00362670"/>
@@ -6316,7 +6469,6 @@
     <w:next w:val="Normal"/>
     <w:link w:val="Heading3Char"/>
     <w:uiPriority w:val="9"/>
-    <w:semiHidden/>
     <w:unhideWhenUsed/>
     <w:qFormat/>
     <w:rsid w:val="00362670"/>
@@ -6339,7 +6491,6 @@
     <w:next w:val="Normal"/>
     <w:link w:val="Heading4Char"/>
     <w:uiPriority w:val="9"/>
-    <w:semiHidden/>
     <w:unhideWhenUsed/>
     <w:qFormat/>
     <w:rsid w:val="00362670"/>
@@ -6509,7 +6660,6 @@
     <w:basedOn w:val="DefaultParagraphFont"/>
     <w:link w:val="Heading2"/>
     <w:uiPriority w:val="9"/>
-    <w:semiHidden/>
     <w:rsid w:val="00362670"/>
     <w:rPr>
       <w:rFonts w:asciiTheme="majorHAnsi" w:eastAsiaTheme="majorEastAsia" w:hAnsiTheme="majorHAnsi" w:cstheme="majorBidi"/>
@@ -6523,7 +6673,6 @@
     <w:basedOn w:val="DefaultParagraphFont"/>
     <w:link w:val="Heading3"/>
     <w:uiPriority w:val="9"/>
-    <w:semiHidden/>
     <w:rsid w:val="00362670"/>
     <w:rPr>
       <w:rFonts w:eastAsiaTheme="majorEastAsia" w:cstheme="majorBidi"/>
@@ -6537,7 +6686,6 @@
     <w:basedOn w:val="DefaultParagraphFont"/>
     <w:link w:val="Heading4"/>
     <w:uiPriority w:val="9"/>
-    <w:semiHidden/>
     <w:rsid w:val="00362670"/>
     <w:rPr>
       <w:rFonts w:eastAsiaTheme="majorEastAsia" w:cstheme="majorBidi"/>

</xml_diff>